<commit_message>
don't ask teacher plz
</commit_message>
<xml_diff>
--- a/24252.docx
+++ b/24252.docx
@@ -8,7 +8,7 @@
           <w:tab w:val="left" w:pos="1013"/>
         </w:tabs>
         <w:rPr>
-          <w:rFonts w:ascii="Microsoft JhengHei" w:eastAsiaTheme="minorEastAsia"/>
+          <w:rFonts w:ascii="Microsoft JhengHei" w:eastAsiaTheme="minorEastAsia" w:hint="eastAsia"/>
         </w:rPr>
         <w:sectPr>
           <w:type w:val="continuous"/>
@@ -17,6 +17,77 @@
           <w:cols w:space="720"/>
         </w:sectPr>
       </w:pPr>
+    </w:p>
+    <w:p>
+      <w:pPr>
+        <w:tabs>
+          <w:tab w:val="left" w:pos="261"/>
+        </w:tabs>
+        <w:spacing w:before="47"/>
+        <w:ind w:hanging="100"/>
+        <w:rPr>
+          <w:rFonts w:hint="eastAsia"/>
+          <w:color w:val="FF0000"/>
+        </w:rPr>
+      </w:pPr>
+      <w:r>
+        <w:rPr>
+          <w:rStyle w:val="md-blockmeta"/>
+          <w:rFonts w:ascii="Open Sans" w:hAnsi="Open Sans" w:cs="Open Sans"/>
+          <w:b/>
+          <w:bCs/>
+          <w:i/>
+          <w:iCs/>
+          <w:color w:val="FF0000"/>
+          <w:shd w:val="clear" w:color="auto" w:fill="FFFFFF"/>
+        </w:rPr>
+        <w:lastRenderedPageBreak/>
+        <w:t xml:space="preserve"> </w:t>
+      </w:r>
+      <w:r>
+        <w:rPr>
+          <w:rStyle w:val="md-plain"/>
+          <w:rFonts w:ascii="Open Sans" w:hAnsi="Open Sans" w:cs="Open Sans"/>
+          <w:b/>
+          <w:bCs/>
+          <w:color w:val="FF0000"/>
+          <w:shd w:val="clear" w:color="auto" w:fill="FFFFFF"/>
+        </w:rPr>
+        <w:t>TJU</w:t>
+      </w:r>
+      <w:r>
+        <w:rPr>
+          <w:rStyle w:val="md-plain"/>
+          <w:rFonts w:ascii="Open Sans" w:hAnsi="Open Sans" w:cs="Open Sans"/>
+          <w:b/>
+          <w:bCs/>
+          <w:color w:val="FF0000"/>
+          <w:shd w:val="clear" w:color="auto" w:fill="FFFFFF"/>
+        </w:rPr>
+        <w:t>的</w:t>
+      </w:r>
+      <w:r>
+        <w:rPr>
+          <w:rStyle w:val="md-plain"/>
+          <w:rFonts w:ascii="Open Sans" w:hAnsi="Open Sans" w:cs="Open Sans"/>
+          <w:b/>
+          <w:bCs/>
+          <w:color w:val="FF0000"/>
+          <w:shd w:val="clear" w:color="auto" w:fill="FFFFFF"/>
+        </w:rPr>
+        <w:t>UU</w:t>
+      </w:r>
+      <w:r>
+        <w:rPr>
+          <w:rStyle w:val="md-plain"/>
+          <w:rFonts w:ascii="Open Sans" w:hAnsi="Open Sans" w:cs="Open Sans"/>
+          <w:b/>
+          <w:bCs/>
+          <w:color w:val="FF0000"/>
+          <w:shd w:val="clear" w:color="auto" w:fill="FFFFFF"/>
+        </w:rPr>
+        <w:t>不要拿往年题问老师！问了题型会改！就没有往年题了！不要问不要问！</w:t>
+      </w:r>
     </w:p>
     <w:p>
       <w:pPr>
@@ -38,7 +109,6 @@
         <w:rPr>
           <w:w w:val="90"/>
         </w:rPr>
-        <w:lastRenderedPageBreak/>
         <w:t>Which</w:t>
       </w:r>
       <w:r>
@@ -3464,7 +3534,7 @@
           </mc:Choice>
           <mc:Fallback>
             <w:pict>
-              <v:group w14:anchorId="7ABF84E7" id="Group 6" o:spid="_x0000_s1026" style="position:absolute;margin-left:90pt;margin-top:20.1pt;width:283.95pt;height:173.95pt;z-index:-15726592;mso-wrap-distance-left:0;mso-wrap-distance-right:0;mso-position-horizontal-relative:page" coordsize="36061,22091" o:gfxdata="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">
+              <v:group w14:anchorId="2EB4D7DD" id="Group 6" o:spid="_x0000_s1026" style="position:absolute;margin-left:90pt;margin-top:20.1pt;width:283.95pt;height:173.95pt;z-index:-15726592;mso-wrap-distance-left:0;mso-wrap-distance-right:0;mso-position-horizontal-relative:page" coordsize="36061,22091" o:gfxdata="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">
                 <v:shapetype id="_x0000_t75" coordsize="21600,21600" o:spt="75" o:preferrelative="t" path="m@4@5l@4@11@9@11@9@5xe" filled="f" stroked="f">
                   <v:stroke joinstyle="miter"/>
                   <v:formulas>
@@ -10385,6 +10455,16 @@
     <w:uiPriority w:val="1"/>
     <w:qFormat/>
   </w:style>
+  <w:style w:type="character" w:customStyle="1" w:styleId="md-blockmeta">
+    <w:name w:val="md-blockmeta"/>
+    <w:basedOn w:val="a0"/>
+    <w:rsid w:val="003E3510"/>
+  </w:style>
+  <w:style w:type="character" w:customStyle="1" w:styleId="md-plain">
+    <w:name w:val="md-plain"/>
+    <w:basedOn w:val="a0"/>
+    <w:rsid w:val="003E3510"/>
+  </w:style>
 </w:styles>
 </file>
 

</xml_diff>